<commit_message>
style: chuẩn hóa biểu mẫu BM - dấu chấm điền tay, giãn dòng Word, gọn header Excel
- Word: placeholder gạch dưới -> dấu chấm; giãn dòng 1.5 cho đoạn thân (trừ trong bảng)
- Excel: placeholder -> dấu chấm ở trường thông tin; bỏ cột trống dư cuối
- Excel: gộp ô khối mã số/ngày/lần ban hành vừa đủ, ưu tiên bề rộng tên công ty
- Thêm scripts/refine_bm_forms.py để tái áp dụng chỉnh sửa hàng loạt
</commit_message>
<xml_diff>
--- a/bm/GC/ISO.BM-GC-18-01 Bản vẽ thiết kế gia công CNC.docx
+++ b/bm/GC/ISO.BM-GC-18-01 Bản vẽ thiết kế gia công CNC.docx
@@ -166,7 +166,7 @@
     </w:tbl>
     <w:p>
       <w:pPr>
-        <w:spacing w:after="120" w:before="200"/>
+        <w:spacing w:after="120" w:before="200" w:line="360" w:lineRule="auto"/>
         <w:jc w:val="center"/>
       </w:pPr>
       <w:r>
@@ -184,7 +184,7 @@
     </w:p>
     <w:p>
       <w:pPr>
-        <w:spacing w:after="60" w:before="60"/>
+        <w:spacing w:after="120" w:before="60" w:line="360" w:lineRule="auto"/>
         <w:jc w:val="left"/>
       </w:pPr>
       <w:r>
@@ -680,7 +680,7 @@
     </w:tbl>
     <w:p>
       <w:pPr>
-        <w:spacing w:after="60" w:before="60"/>
+        <w:spacing w:after="120" w:before="60" w:line="360" w:lineRule="auto"/>
         <w:jc w:val="left"/>
       </w:pPr>
       <w:r>
@@ -698,7 +698,7 @@
     </w:p>
     <w:p>
       <w:pPr>
-        <w:spacing w:after="60" w:before="60"/>
+        <w:spacing w:after="120" w:before="60" w:line="360" w:lineRule="auto"/>
         <w:jc w:val="left"/>
       </w:pPr>
       <w:r>
@@ -769,7 +769,7 @@
     </w:tbl>
     <w:p>
       <w:pPr>
-        <w:spacing w:after="60" w:before="60"/>
+        <w:spacing w:after="120" w:before="60" w:line="360" w:lineRule="auto"/>
         <w:jc w:val="left"/>
       </w:pPr>
       <w:r>
@@ -787,7 +787,7 @@
     </w:p>
     <w:p>
       <w:pPr>
-        <w:spacing w:after="60" w:before="60"/>
+        <w:spacing w:after="120" w:before="60" w:line="360" w:lineRule="auto"/>
         <w:jc w:val="left"/>
       </w:pPr>
       <w:r>
@@ -1394,7 +1394,7 @@
     </w:tbl>
     <w:p>
       <w:pPr>
-        <w:spacing w:after="60" w:before="60"/>
+        <w:spacing w:after="120" w:before="60" w:line="360" w:lineRule="auto"/>
         <w:jc w:val="left"/>
       </w:pPr>
       <w:r>
@@ -1882,7 +1882,7 @@
     </w:tbl>
     <w:p>
       <w:pPr>
-        <w:spacing w:after="60" w:before="60"/>
+        <w:spacing w:after="120" w:before="60" w:line="360" w:lineRule="auto"/>
         <w:jc w:val="left"/>
       </w:pPr>
       <w:r>

</xml_diff>